<commit_message>
Add SHAP diagnostic plots and Panel data heterogeneity/macro trend graphs
</commit_message>
<xml_diff>
--- a/Greenflation_Findings.docx
+++ b/Greenflation_Findings.docx
@@ -1326,6 +1326,208 @@
         </w:drawing>
       </w:r>
     </w:p>
+    <w:p>
+      <w:pPr>
+        <w:pStyle w:val="Heading1"/>
+      </w:pPr>
+      <w:r>
+        <w:t>4. Advanced XGBoost &amp; SHAP Diagnostics</w:t>
+      </w:r>
+    </w:p>
+    <w:p>
+      <w:r>
+        <w:t>To further dissect the non-linear relationship and the magnitude of the green transition shock, we employ SHAP (SHapley Additive exPlanations) values. The summary plot below demonstrates the directional impact of each feature, while the dependence plot isolates the effect of CO2 emissions on domestic inflation.</w:t>
+      </w:r>
+    </w:p>
+    <w:p>
+      <w:pPr>
+        <w:pStyle w:val="Heading2"/>
+      </w:pPr>
+      <w:r>
+        <w:t>SHAP Summary Plot</w:t>
+      </w:r>
+    </w:p>
+    <w:p>
+      <w:r>
+        <w:drawing>
+          <wp:inline xmlns:a="http://schemas.openxmlformats.org/drawingml/2006/main" xmlns:pic="http://schemas.openxmlformats.org/drawingml/2006/picture">
+            <wp:extent cx="5486400" cy="2438400"/>
+            <wp:docPr id="3" name="Picture 3"/>
+            <wp:cNvGraphicFramePr>
+              <a:graphicFrameLocks noChangeAspect="1"/>
+            </wp:cNvGraphicFramePr>
+            <a:graphic>
+              <a:graphicData uri="http://schemas.openxmlformats.org/drawingml/2006/picture">
+                <pic:pic>
+                  <pic:nvPicPr>
+                    <pic:cNvPr id="0" name="shap_summary.png"/>
+                    <pic:cNvPicPr/>
+                  </pic:nvPicPr>
+                  <pic:blipFill>
+                    <a:blip r:embed="rId11"/>
+                    <a:stretch>
+                      <a:fillRect/>
+                    </a:stretch>
+                  </pic:blipFill>
+                  <pic:spPr>
+                    <a:xfrm>
+                      <a:off x="0" y="0"/>
+                      <a:ext cx="5486400" cy="2438400"/>
+                    </a:xfrm>
+                    <a:prstGeom prst="rect"/>
+                  </pic:spPr>
+                </pic:pic>
+              </a:graphicData>
+            </a:graphic>
+          </wp:inline>
+        </w:drawing>
+      </w:r>
+    </w:p>
+    <w:p>
+      <w:pPr>
+        <w:pStyle w:val="Heading2"/>
+      </w:pPr>
+      <w:r>
+        <w:t>SHAP Dependence Plot (CO2 Emissions)</w:t>
+      </w:r>
+    </w:p>
+    <w:p>
+      <w:r>
+        <w:drawing>
+          <wp:inline xmlns:a="http://schemas.openxmlformats.org/drawingml/2006/main" xmlns:pic="http://schemas.openxmlformats.org/drawingml/2006/picture">
+            <wp:extent cx="5486400" cy="4547203"/>
+            <wp:docPr id="4" name="Picture 4"/>
+            <wp:cNvGraphicFramePr>
+              <a:graphicFrameLocks noChangeAspect="1"/>
+            </wp:cNvGraphicFramePr>
+            <a:graphic>
+              <a:graphicData uri="http://schemas.openxmlformats.org/drawingml/2006/picture">
+                <pic:pic>
+                  <pic:nvPicPr>
+                    <pic:cNvPr id="0" name="shap_dependence_co2.png"/>
+                    <pic:cNvPicPr/>
+                  </pic:nvPicPr>
+                  <pic:blipFill>
+                    <a:blip r:embed="rId12"/>
+                    <a:stretch>
+                      <a:fillRect/>
+                    </a:stretch>
+                  </pic:blipFill>
+                  <pic:spPr>
+                    <a:xfrm>
+                      <a:off x="0" y="0"/>
+                      <a:ext cx="5486400" cy="4547203"/>
+                    </a:xfrm>
+                    <a:prstGeom prst="rect"/>
+                  </pic:spPr>
+                </pic:pic>
+              </a:graphicData>
+            </a:graphic>
+          </wp:inline>
+        </w:drawing>
+      </w:r>
+    </w:p>
+    <w:p>
+      <w:pPr>
+        <w:pStyle w:val="Heading1"/>
+      </w:pPr>
+      <w:r>
+        <w:t>5. Panel Data Visualization</w:t>
+      </w:r>
+    </w:p>
+    <w:p>
+      <w:r>
+        <w:t>The structural dynamics of the panel data are visualized through macro trends over time and cross-sectional heterogeneity.</w:t>
+      </w:r>
+    </w:p>
+    <w:p>
+      <w:pPr>
+        <w:pStyle w:val="Heading2"/>
+      </w:pPr>
+      <w:r>
+        <w:t>Macro Trend: Global Average Inflation and CO2</w:t>
+      </w:r>
+    </w:p>
+    <w:p>
+      <w:r>
+        <w:drawing>
+          <wp:inline xmlns:a="http://schemas.openxmlformats.org/drawingml/2006/main" xmlns:pic="http://schemas.openxmlformats.org/drawingml/2006/picture">
+            <wp:extent cx="5486400" cy="3272979"/>
+            <wp:docPr id="5" name="Picture 5"/>
+            <wp:cNvGraphicFramePr>
+              <a:graphicFrameLocks noChangeAspect="1"/>
+            </wp:cNvGraphicFramePr>
+            <a:graphic>
+              <a:graphicData uri="http://schemas.openxmlformats.org/drawingml/2006/picture">
+                <pic:pic>
+                  <pic:nvPicPr>
+                    <pic:cNvPr id="0" name="panel_time_trend.png"/>
+                    <pic:cNvPicPr/>
+                  </pic:nvPicPr>
+                  <pic:blipFill>
+                    <a:blip r:embed="rId13"/>
+                    <a:stretch>
+                      <a:fillRect/>
+                    </a:stretch>
+                  </pic:blipFill>
+                  <pic:spPr>
+                    <a:xfrm>
+                      <a:off x="0" y="0"/>
+                      <a:ext cx="5486400" cy="3272979"/>
+                    </a:xfrm>
+                    <a:prstGeom prst="rect"/>
+                  </pic:spPr>
+                </pic:pic>
+              </a:graphicData>
+            </a:graphic>
+          </wp:inline>
+        </w:drawing>
+      </w:r>
+    </w:p>
+    <w:p>
+      <w:pPr>
+        <w:pStyle w:val="Heading2"/>
+      </w:pPr>
+      <w:r>
+        <w:t>Cross-Sectional Heterogeneity (Inflation Variance by Country)</w:t>
+      </w:r>
+    </w:p>
+    <w:p>
+      <w:r>
+        <w:drawing>
+          <wp:inline xmlns:a="http://schemas.openxmlformats.org/drawingml/2006/main" xmlns:pic="http://schemas.openxmlformats.org/drawingml/2006/picture">
+            <wp:extent cx="5486400" cy="2722436"/>
+            <wp:docPr id="6" name="Picture 6"/>
+            <wp:cNvGraphicFramePr>
+              <a:graphicFrameLocks noChangeAspect="1"/>
+            </wp:cNvGraphicFramePr>
+            <a:graphic>
+              <a:graphicData uri="http://schemas.openxmlformats.org/drawingml/2006/picture">
+                <pic:pic>
+                  <pic:nvPicPr>
+                    <pic:cNvPr id="0" name="panel_heterogeneity.png"/>
+                    <pic:cNvPicPr/>
+                  </pic:nvPicPr>
+                  <pic:blipFill>
+                    <a:blip r:embed="rId14"/>
+                    <a:stretch>
+                      <a:fillRect/>
+                    </a:stretch>
+                  </pic:blipFill>
+                  <pic:spPr>
+                    <a:xfrm>
+                      <a:off x="0" y="0"/>
+                      <a:ext cx="5486400" cy="2722436"/>
+                    </a:xfrm>
+                    <a:prstGeom prst="rect"/>
+                  </pic:spPr>
+                </pic:pic>
+              </a:graphicData>
+            </a:graphic>
+          </wp:inline>
+        </w:drawing>
+      </w:r>
+    </w:p>
     <w:sectPr>
       <w:pgSz w:w="12240" w:h="15840"/>
       <w:pgMar w:top="1440" w:right="1800" w:bottom="1440" w:left="1800" w:header="720" w:footer="720" w:gutter="0"/>

</xml_diff>